<commit_message>
feat: add shareable job links with public job details page and share button
</commit_message>
<xml_diff>
--- a/word/DPA_NeonDB.docx
+++ b/word/DPA_NeonDB.docx
@@ -8,8 +8,8 @@
       </w:pPr>
       <w:r>
         <w:rPr>
-          <w:color w:val="1F3B5C"/>
-          <w:sz w:val="40"/>
+          <w:rFonts w:ascii="Calibri" w:hAnsi="Calibri"/>
+          <w:color w:val="000000"/>
         </w:rPr>
         <w:t>DATA PROTECTION AGREEMENT (DPA)</w:t>
       </w:r>
@@ -20,8 +20,8 @@
       </w:pPr>
       <w:r>
         <w:rPr>
-          <w:color w:val="1F3B5C"/>
-          <w:sz w:val="40"/>
+          <w:rFonts w:ascii="Calibri" w:hAnsi="Calibri"/>
+          <w:color w:val="000000"/>
         </w:rPr>
         <w:t>NeonDB — LINEKORA</w:t>
       </w:r>
@@ -29,6 +29,7 @@
     <w:p>
       <w:r>
         <w:rPr>
+          <w:rFonts w:ascii="Calibri" w:hAnsi="Calibri"/>
           <w:b/>
         </w:rPr>
         <w:t>Between:</w:t>
@@ -37,57 +38,127 @@
     <w:p>
       <w:pPr>
         <w:pStyle w:val="ListBullet"/>
+        <w:ind w:left="360"/>
       </w:pPr>
       <w:r>
         <w:rPr>
+          <w:rFonts w:ascii="Calibri" w:hAnsi="Calibri"/>
           <w:b/>
         </w:rPr>
         <w:t>Data Controller:</w:t>
       </w:r>
       <w:r>
-        <w:t xml:space="preserve"> LINEKORA (hereinafter "the Company")</w:t>
+        <w:rPr>
+          <w:rFonts w:ascii="Calibri" w:hAnsi="Calibri"/>
+        </w:rPr>
+        <w:t xml:space="preserve"> NDIVE LABS LTD (registered in Rwanda), trading as LINEKORA (hereinafter "the Company")</w:t>
       </w:r>
     </w:p>
     <w:p>
       <w:pPr>
         <w:pStyle w:val="ListBullet"/>
+        <w:ind w:left="360"/>
       </w:pPr>
       <w:r>
         <w:rPr>
+          <w:rFonts w:ascii="Calibri" w:hAnsi="Calibri"/>
           <w:b/>
         </w:rPr>
         <w:t>Data Processor:</w:t>
       </w:r>
       <w:r>
+        <w:rPr>
+          <w:rFonts w:ascii="Calibri" w:hAnsi="Calibri"/>
+        </w:rPr>
         <w:t xml:space="preserve"> Neon (NeonDB Inc.) (hereinafter "Neon")</w:t>
       </w:r>
     </w:p>
     <w:p>
       <w:r>
         <w:rPr>
+          <w:rFonts w:ascii="Calibri" w:hAnsi="Calibri"/>
           <w:b/>
         </w:rPr>
         <w:t>Effective Date:</w:t>
       </w:r>
       <w:r>
+        <w:rPr>
+          <w:rFonts w:ascii="Calibri" w:hAnsi="Calibri"/>
+        </w:rPr>
         <w:t xml:space="preserve"> _______________</w:t>
       </w:r>
     </w:p>
     <w:p>
       <w:r>
         <w:rPr>
+          <w:rFonts w:ascii="Calibri" w:hAnsi="Calibri"/>
           <w:b/>
         </w:rPr>
         <w:t>Agreement Reference:</w:t>
       </w:r>
       <w:r>
+        <w:rPr>
+          <w:rFonts w:ascii="Calibri" w:hAnsi="Calibri"/>
+        </w:rPr>
         <w:t xml:space="preserve"> LINEKORA-DPA-NEONDB-2026</w:t>
       </w:r>
     </w:p>
     <w:p>
+      <w:pPr>
+        <w:shd w:val="clear" w:color="auto" w:fill="F2F2F2"/>
+      </w:pPr>
       <w:r>
-        <w:t>______________________________</w:t>
+        <w:rPr>
+          <w:rFonts w:ascii="Calibri" w:hAnsi="Calibri"/>
+          <w:b/>
+          <w:sz w:val="20"/>
+        </w:rPr>
+        <w:t>IMPORTANT — READ FIRST:</w:t>
       </w:r>
+      <w:r>
+        <w:rPr>
+          <w:rFonts w:ascii="Calibri" w:hAnsi="Calibri"/>
+          <w:sz w:val="20"/>
+        </w:rPr>
+        <w:t xml:space="preserve"> This document is LINEKORA's </w:t>
+      </w:r>
+      <w:r>
+        <w:rPr>
+          <w:rFonts w:ascii="Calibri" w:hAnsi="Calibri"/>
+          <w:b/>
+          <w:sz w:val="20"/>
+        </w:rPr>
+        <w:t>internal reference copy</w:t>
+      </w:r>
+      <w:r>
+        <w:rPr>
+          <w:rFonts w:ascii="Calibri" w:hAnsi="Calibri"/>
+          <w:sz w:val="20"/>
+        </w:rPr>
+        <w:t xml:space="preserve">. The </w:t>
+      </w:r>
+      <w:r>
+        <w:rPr>
+          <w:rFonts w:ascii="Calibri" w:hAnsi="Calibri"/>
+          <w:b/>
+          <w:sz w:val="20"/>
+        </w:rPr>
+        <w:t>binding contract</w:t>
+      </w:r>
+      <w:r>
+        <w:rPr>
+          <w:rFonts w:ascii="Calibri" w:hAnsi="Calibri"/>
+          <w:sz w:val="20"/>
+        </w:rPr>
+        <w:t xml:space="preserve"> is Neon's official Data Processing Agreement, accepted under Neon's Terms of Service, available at https://neon.tech/legal. Download and keep that official DPA for the Rwanda DPO. Do not present this template to Neon for signature.</w:t>
+      </w:r>
+    </w:p>
+    <w:p>
+      <w:pPr>
+        <w:pBdr>
+          <w:bottom w:val="single" w:sz="6" w:space="1" w:color="666666"/>
+        </w:pBdr>
+      </w:pPr>
     </w:p>
     <w:p>
       <w:pPr>
@@ -95,30 +166,39 @@
       </w:pPr>
       <w:r>
         <w:rPr>
-          <w:color w:val="1F3B5C"/>
-          <w:sz w:val="30"/>
+          <w:rFonts w:ascii="Calibri" w:hAnsi="Calibri"/>
+          <w:color w:val="000000"/>
         </w:rPr>
         <w:t>1. PURPOSE</w:t>
       </w:r>
     </w:p>
     <w:p>
       <w:r>
+        <w:rPr>
+          <w:rFonts w:ascii="Calibri" w:hAnsi="Calibri"/>
+        </w:rPr>
         <w:t xml:space="preserve">This DPA sets out the terms that apply when Personal Data is processed by Neon on behalf of LINEKORA in the course of providing database hosting services. This DPA is required for compliance with the </w:t>
       </w:r>
       <w:r>
         <w:rPr>
+          <w:rFonts w:ascii="Calibri" w:hAnsi="Calibri"/>
           <w:b/>
         </w:rPr>
-        <w:t>Rwanda Data Protection Law No. 3/2021</w:t>
+        <w:t>Rwanda Data Protection Law No. 058/2021 of 13/10/2021</w:t>
       </w:r>
       <w:r>
+        <w:rPr>
+          <w:rFonts w:ascii="Calibri" w:hAnsi="Calibri"/>
+        </w:rPr>
         <w:t xml:space="preserve"> and authorization for international storage.</w:t>
       </w:r>
     </w:p>
     <w:p>
-      <w:r>
-        <w:t>______________________________</w:t>
-      </w:r>
+      <w:pPr>
+        <w:pBdr>
+          <w:bottom w:val="single" w:sz="6" w:space="1" w:color="666666"/>
+        </w:pBdr>
+      </w:pPr>
     </w:p>
     <w:p>
       <w:pPr>
@@ -126,8 +206,8 @@
       </w:pPr>
       <w:r>
         <w:rPr>
-          <w:color w:val="1F3B5C"/>
-          <w:sz w:val="30"/>
+          <w:rFonts w:ascii="Calibri" w:hAnsi="Calibri"/>
+          <w:color w:val="000000"/>
         </w:rPr>
         <w:t>2. SCOPE OF PROCESSING</w:t>
       </w:r>
@@ -138,8 +218,8 @@
       </w:pPr>
       <w:r>
         <w:rPr>
-          <w:color w:val="1F3B5C"/>
-          <w:sz w:val="24"/>
+          <w:rFonts w:ascii="Calibri" w:hAnsi="Calibri"/>
+          <w:color w:val="000000"/>
         </w:rPr>
         <w:t>2.1 Data Categories Processed by Neon</w:t>
       </w:r>
@@ -148,7 +228,6 @@
       <w:tblPr>
         <w:tblStyle w:val="TableGrid"/>
         <w:tblW w:type="auto" w:w="0"/>
-        <w:jc w:val="center"/>
         <w:tblLook w:firstColumn="1" w:firstRow="1" w:lastColumn="0" w:lastRow="0" w:noHBand="0" w:noVBand="1" w:val="04A0"/>
       </w:tblPr>
       <w:tblGrid>
@@ -160,21 +239,13 @@
         <w:tc>
           <w:tcPr>
             <w:tcW w:type="dxa" w:w="2880"/>
-            <w:shd w:val="clear" w:color="auto" w:fill="1F3B5C"/>
           </w:tcPr>
           <w:p>
+            <w:r/>
             <w:r>
               <w:rPr>
+                <w:rFonts w:ascii="Calibri" w:hAnsi="Calibri"/>
                 <w:b/>
-                <w:color w:val="FFFFFF"/>
-                <w:sz w:val="18"/>
-              </w:rPr>
-            </w:r>
-            <w:r>
-              <w:rPr>
-                <w:b/>
-                <w:color w:val="FFFFFF"/>
-                <w:sz w:val="18"/>
               </w:rPr>
               <w:t>Data Category</w:t>
             </w:r>
@@ -183,21 +254,13 @@
         <w:tc>
           <w:tcPr>
             <w:tcW w:type="dxa" w:w="2880"/>
-            <w:shd w:val="clear" w:color="auto" w:fill="1F3B5C"/>
           </w:tcPr>
           <w:p>
+            <w:r/>
             <w:r>
               <w:rPr>
+                <w:rFonts w:ascii="Calibri" w:hAnsi="Calibri"/>
                 <w:b/>
-                <w:color w:val="FFFFFF"/>
-                <w:sz w:val="18"/>
-              </w:rPr>
-            </w:r>
-            <w:r>
-              <w:rPr>
-                <w:b/>
-                <w:color w:val="FFFFFF"/>
-                <w:sz w:val="18"/>
               </w:rPr>
               <w:t>Data Elements</w:t>
             </w:r>
@@ -206,21 +269,13 @@
         <w:tc>
           <w:tcPr>
             <w:tcW w:type="dxa" w:w="2880"/>
-            <w:shd w:val="clear" w:color="auto" w:fill="1F3B5C"/>
           </w:tcPr>
           <w:p>
+            <w:r/>
             <w:r>
               <w:rPr>
+                <w:rFonts w:ascii="Calibri" w:hAnsi="Calibri"/>
                 <w:b/>
-                <w:color w:val="FFFFFF"/>
-                <w:sz w:val="18"/>
-              </w:rPr>
-            </w:r>
-            <w:r>
-              <w:rPr>
-                <w:b/>
-                <w:color w:val="FFFFFF"/>
-                <w:sz w:val="18"/>
               </w:rPr>
               <w:t>Purpose</w:t>
             </w:r>
@@ -233,14 +288,10 @@
             <w:tcW w:type="dxa" w:w="2880"/>
           </w:tcPr>
           <w:p>
+            <w:r/>
             <w:r>
               <w:rPr>
-                <w:sz w:val="18"/>
-              </w:rPr>
-            </w:r>
-            <w:r>
-              <w:rPr>
-                <w:sz w:val="18"/>
+                <w:rFonts w:ascii="Calibri" w:hAnsi="Calibri"/>
               </w:rPr>
               <w:t>Worker PII</w:t>
             </w:r>
@@ -251,14 +302,10 @@
             <w:tcW w:type="dxa" w:w="2880"/>
           </w:tcPr>
           <w:p>
+            <w:r/>
             <w:r>
               <w:rPr>
-                <w:sz w:val="18"/>
-              </w:rPr>
-            </w:r>
-            <w:r>
-              <w:rPr>
-                <w:sz w:val="18"/>
+                <w:rFonts w:ascii="Calibri" w:hAnsi="Calibri"/>
               </w:rPr>
               <w:t>Name, Phone, Gender, District, Sector, Village, ID, Photo, Skills</w:t>
             </w:r>
@@ -269,14 +316,10 @@
             <w:tcW w:type="dxa" w:w="2880"/>
           </w:tcPr>
           <w:p>
+            <w:r/>
             <w:r>
               <w:rPr>
-                <w:sz w:val="18"/>
-              </w:rPr>
-            </w:r>
-            <w:r>
-              <w:rPr>
-                <w:sz w:val="18"/>
+                <w:rFonts w:ascii="Calibri" w:hAnsi="Calibri"/>
               </w:rPr>
               <w:t>Registration, KYC, Task Matching</w:t>
             </w:r>
@@ -287,17 +330,12 @@
         <w:tc>
           <w:tcPr>
             <w:tcW w:type="dxa" w:w="2880"/>
-            <w:shd w:val="clear" w:color="auto" w:fill="EAF1F8"/>
           </w:tcPr>
           <w:p>
+            <w:r/>
             <w:r>
               <w:rPr>
-                <w:sz w:val="18"/>
-              </w:rPr>
-            </w:r>
-            <w:r>
-              <w:rPr>
-                <w:sz w:val="18"/>
+                <w:rFonts w:ascii="Calibri" w:hAnsi="Calibri"/>
               </w:rPr>
               <w:t>Employer PII</w:t>
             </w:r>
@@ -306,17 +344,12 @@
         <w:tc>
           <w:tcPr>
             <w:tcW w:type="dxa" w:w="2880"/>
-            <w:shd w:val="clear" w:color="auto" w:fill="EAF1F8"/>
           </w:tcPr>
           <w:p>
+            <w:r/>
             <w:r>
               <w:rPr>
-                <w:sz w:val="18"/>
-              </w:rPr>
-            </w:r>
-            <w:r>
-              <w:rPr>
-                <w:sz w:val="18"/>
+                <w:rFonts w:ascii="Calibri" w:hAnsi="Calibri"/>
               </w:rPr>
               <w:t>Name, Phone, Company, Location, Payment Details</w:t>
             </w:r>
@@ -325,17 +358,12 @@
         <w:tc>
           <w:tcPr>
             <w:tcW w:type="dxa" w:w="2880"/>
-            <w:shd w:val="clear" w:color="auto" w:fill="EAF1F8"/>
           </w:tcPr>
           <w:p>
+            <w:r/>
             <w:r>
               <w:rPr>
-                <w:sz w:val="18"/>
-              </w:rPr>
-            </w:r>
-            <w:r>
-              <w:rPr>
-                <w:sz w:val="18"/>
+                <w:rFonts w:ascii="Calibri" w:hAnsi="Calibri"/>
               </w:rPr>
               <w:t>Registration, Task Creation, Payments</w:t>
             </w:r>
@@ -348,14 +376,10 @@
             <w:tcW w:type="dxa" w:w="2880"/>
           </w:tcPr>
           <w:p>
+            <w:r/>
             <w:r>
               <w:rPr>
-                <w:sz w:val="18"/>
-              </w:rPr>
-            </w:r>
-            <w:r>
-              <w:rPr>
-                <w:sz w:val="18"/>
+                <w:rFonts w:ascii="Calibri" w:hAnsi="Calibri"/>
               </w:rPr>
               <w:t>User Activity Data</w:t>
             </w:r>
@@ -366,14 +390,10 @@
             <w:tcW w:type="dxa" w:w="2880"/>
           </w:tcPr>
           <w:p>
+            <w:r/>
             <w:r>
               <w:rPr>
-                <w:sz w:val="18"/>
-              </w:rPr>
-            </w:r>
-            <w:r>
-              <w:rPr>
-                <w:sz w:val="18"/>
+                <w:rFonts w:ascii="Calibri" w:hAnsi="Calibri"/>
               </w:rPr>
               <w:t>IP Address, Device ID, Geolocation</w:t>
             </w:r>
@@ -384,14 +404,10 @@
             <w:tcW w:type="dxa" w:w="2880"/>
           </w:tcPr>
           <w:p>
+            <w:r/>
             <w:r>
               <w:rPr>
-                <w:sz w:val="18"/>
-              </w:rPr>
-            </w:r>
-            <w:r>
-              <w:rPr>
-                <w:sz w:val="18"/>
+                <w:rFonts w:ascii="Calibri" w:hAnsi="Calibri"/>
               </w:rPr>
               <w:t>Security, Analytics</w:t>
             </w:r>
@@ -402,17 +418,12 @@
         <w:tc>
           <w:tcPr>
             <w:tcW w:type="dxa" w:w="2880"/>
-            <w:shd w:val="clear" w:color="auto" w:fill="EAF1F8"/>
           </w:tcPr>
           <w:p>
+            <w:r/>
             <w:r>
               <w:rPr>
-                <w:sz w:val="18"/>
-              </w:rPr>
-            </w:r>
-            <w:r>
-              <w:rPr>
-                <w:sz w:val="18"/>
+                <w:rFonts w:ascii="Calibri" w:hAnsi="Calibri"/>
               </w:rPr>
               <w:t>Task Data</w:t>
             </w:r>
@@ -421,17 +432,12 @@
         <w:tc>
           <w:tcPr>
             <w:tcW w:type="dxa" w:w="2880"/>
-            <w:shd w:val="clear" w:color="auto" w:fill="EAF1F8"/>
           </w:tcPr>
           <w:p>
+            <w:r/>
             <w:r>
               <w:rPr>
-                <w:sz w:val="18"/>
-              </w:rPr>
-            </w:r>
-            <w:r>
-              <w:rPr>
-                <w:sz w:val="18"/>
+                <w:rFonts w:ascii="Calibri" w:hAnsi="Calibri"/>
               </w:rPr>
               <w:t>Task descriptions, Requirements, Budgets</w:t>
             </w:r>
@@ -440,17 +446,12 @@
         <w:tc>
           <w:tcPr>
             <w:tcW w:type="dxa" w:w="2880"/>
-            <w:shd w:val="clear" w:color="auto" w:fill="EAF1F8"/>
           </w:tcPr>
           <w:p>
+            <w:r/>
             <w:r>
               <w:rPr>
-                <w:sz w:val="18"/>
-              </w:rPr>
-            </w:r>
-            <w:r>
-              <w:rPr>
-                <w:sz w:val="18"/>
+                <w:rFonts w:ascii="Calibri" w:hAnsi="Calibri"/>
               </w:rPr>
               <w:t>Service delivery</w:t>
             </w:r>
@@ -463,14 +464,10 @@
             <w:tcW w:type="dxa" w:w="2880"/>
           </w:tcPr>
           <w:p>
+            <w:r/>
             <w:r>
               <w:rPr>
-                <w:sz w:val="18"/>
-              </w:rPr>
-            </w:r>
-            <w:r>
-              <w:rPr>
-                <w:sz w:val="18"/>
+                <w:rFonts w:ascii="Calibri" w:hAnsi="Calibri"/>
               </w:rPr>
               <w:t>Transaction Logs</w:t>
             </w:r>
@@ -481,14 +478,10 @@
             <w:tcW w:type="dxa" w:w="2880"/>
           </w:tcPr>
           <w:p>
+            <w:r/>
             <w:r>
               <w:rPr>
-                <w:sz w:val="18"/>
-              </w:rPr>
-            </w:r>
-            <w:r>
-              <w:rPr>
-                <w:sz w:val="18"/>
+                <w:rFonts w:ascii="Calibri" w:hAnsi="Calibri"/>
               </w:rPr>
               <w:t>Transaction references, Timestamps</w:t>
             </w:r>
@@ -499,14 +492,10 @@
             <w:tcW w:type="dxa" w:w="2880"/>
           </w:tcPr>
           <w:p>
+            <w:r/>
             <w:r>
               <w:rPr>
-                <w:sz w:val="18"/>
-              </w:rPr>
-            </w:r>
-            <w:r>
-              <w:rPr>
-                <w:sz w:val="18"/>
+                <w:rFonts w:ascii="Calibri" w:hAnsi="Calibri"/>
               </w:rPr>
               <w:t>Record keeping</w:t>
             </w:r>
@@ -517,17 +506,12 @@
         <w:tc>
           <w:tcPr>
             <w:tcW w:type="dxa" w:w="2880"/>
-            <w:shd w:val="clear" w:color="auto" w:fill="EAF1F8"/>
           </w:tcPr>
           <w:p>
+            <w:r/>
             <w:r>
               <w:rPr>
-                <w:sz w:val="18"/>
-              </w:rPr>
-            </w:r>
-            <w:r>
-              <w:rPr>
-                <w:sz w:val="18"/>
+                <w:rFonts w:ascii="Calibri" w:hAnsi="Calibri"/>
               </w:rPr>
               <w:t>Support Tickets</w:t>
             </w:r>
@@ -536,17 +520,12 @@
         <w:tc>
           <w:tcPr>
             <w:tcW w:type="dxa" w:w="2880"/>
-            <w:shd w:val="clear" w:color="auto" w:fill="EAF1F8"/>
           </w:tcPr>
           <w:p>
+            <w:r/>
             <w:r>
               <w:rPr>
-                <w:sz w:val="18"/>
-              </w:rPr>
-            </w:r>
-            <w:r>
-              <w:rPr>
-                <w:sz w:val="18"/>
+                <w:rFonts w:ascii="Calibri" w:hAnsi="Calibri"/>
               </w:rPr>
               <w:t>Name, Phone, Issue Description</w:t>
             </w:r>
@@ -555,17 +534,12 @@
         <w:tc>
           <w:tcPr>
             <w:tcW w:type="dxa" w:w="2880"/>
-            <w:shd w:val="clear" w:color="auto" w:fill="EAF1F8"/>
           </w:tcPr>
           <w:p>
+            <w:r/>
             <w:r>
               <w:rPr>
-                <w:sz w:val="18"/>
-              </w:rPr>
-            </w:r>
-            <w:r>
-              <w:rPr>
-                <w:sz w:val="18"/>
+                <w:rFonts w:ascii="Calibri" w:hAnsi="Calibri"/>
               </w:rPr>
               <w:t>Customer support</w:t>
             </w:r>
@@ -580,38 +554,53 @@
       </w:pPr>
       <w:r>
         <w:rPr>
-          <w:color w:val="1F3B5C"/>
-          <w:sz w:val="24"/>
+          <w:rFonts w:ascii="Calibri" w:hAnsi="Calibri"/>
+          <w:color w:val="000000"/>
         </w:rPr>
         <w:t>2.2 Purpose of Processing</w:t>
       </w:r>
     </w:p>
     <w:p>
       <w:r>
+        <w:rPr>
+          <w:rFonts w:ascii="Calibri" w:hAnsi="Calibri"/>
+        </w:rPr>
         <w:t>Neon shall process Personal Data solely for:</w:t>
       </w:r>
     </w:p>
     <w:p>
       <w:pPr>
         <w:pStyle w:val="ListBullet"/>
+        <w:ind w:left="360"/>
       </w:pPr>
       <w:r>
+        <w:rPr>
+          <w:rFonts w:ascii="Calibri" w:hAnsi="Calibri"/>
+        </w:rPr>
         <w:t>Primary database hosting for LINEKORA applications</w:t>
       </w:r>
     </w:p>
     <w:p>
       <w:pPr>
         <w:pStyle w:val="ListBullet"/>
+        <w:ind w:left="360"/>
       </w:pPr>
       <w:r>
+        <w:rPr>
+          <w:rFonts w:ascii="Calibri" w:hAnsi="Calibri"/>
+        </w:rPr>
         <w:t>Data storage, retrieval, and management</w:t>
       </w:r>
     </w:p>
     <w:p>
       <w:pPr>
         <w:pStyle w:val="ListBullet"/>
+        <w:ind w:left="360"/>
       </w:pPr>
       <w:r>
+        <w:rPr>
+          <w:rFonts w:ascii="Calibri" w:hAnsi="Calibri"/>
+        </w:rPr>
         <w:t>Backups and disaster recovery</w:t>
       </w:r>
     </w:p>
@@ -621,21 +610,26 @@
       </w:pPr>
       <w:r>
         <w:rPr>
-          <w:color w:val="1F3B5C"/>
-          <w:sz w:val="24"/>
+          <w:rFonts w:ascii="Calibri" w:hAnsi="Calibri"/>
+          <w:color w:val="000000"/>
         </w:rPr>
         <w:t>2.3 Duration of Processing</w:t>
       </w:r>
     </w:p>
     <w:p>
       <w:r>
+        <w:rPr>
+          <w:rFonts w:ascii="Calibri" w:hAnsi="Calibri"/>
+        </w:rPr>
         <w:t>This DPA shall remain in effect for the duration of the Neon service agreement.</w:t>
       </w:r>
     </w:p>
     <w:p>
-      <w:r>
-        <w:t>______________________________</w:t>
-      </w:r>
+      <w:pPr>
+        <w:pBdr>
+          <w:bottom w:val="single" w:sz="6" w:space="1" w:color="666666"/>
+        </w:pBdr>
+      </w:pPr>
     </w:p>
     <w:p>
       <w:pPr>
@@ -643,8 +637,8 @@
       </w:pPr>
       <w:r>
         <w:rPr>
-          <w:color w:val="1F3B5C"/>
-          <w:sz w:val="30"/>
+          <w:rFonts w:ascii="Calibri" w:hAnsi="Calibri"/>
+          <w:color w:val="000000"/>
         </w:rPr>
         <w:t>3. OBLIGATIONS OF NEON</w:t>
       </w:r>
@@ -655,8 +649,8 @@
       </w:pPr>
       <w:r>
         <w:rPr>
-          <w:color w:val="1F3B5C"/>
-          <w:sz w:val="24"/>
+          <w:rFonts w:ascii="Calibri" w:hAnsi="Calibri"/>
+          <w:color w:val="000000"/>
         </w:rPr>
         <w:t>3.1 Processing Instructions</w:t>
       </w:r>
@@ -664,24 +658,36 @@
     <w:p>
       <w:pPr>
         <w:pStyle w:val="ListBullet"/>
+        <w:ind w:left="360"/>
       </w:pPr>
       <w:r>
+        <w:rPr>
+          <w:rFonts w:ascii="Calibri" w:hAnsi="Calibri"/>
+        </w:rPr>
         <w:t>Process Personal Data only on documented instructions from LINEKORA</w:t>
       </w:r>
     </w:p>
     <w:p>
       <w:pPr>
         <w:pStyle w:val="ListBullet"/>
+        <w:ind w:left="360"/>
       </w:pPr>
       <w:r>
+        <w:rPr>
+          <w:rFonts w:ascii="Calibri" w:hAnsi="Calibri"/>
+        </w:rPr>
         <w:t>Immediately inform LINEKORA if an instruction infringes on data protection laws</w:t>
       </w:r>
     </w:p>
     <w:p>
       <w:pPr>
         <w:pStyle w:val="ListBullet"/>
+        <w:ind w:left="360"/>
       </w:pPr>
       <w:r>
+        <w:rPr>
+          <w:rFonts w:ascii="Calibri" w:hAnsi="Calibri"/>
+        </w:rPr>
         <w:t>Not process Personal Data for any purpose other than the agreed services</w:t>
       </w:r>
     </w:p>
@@ -691,8 +697,8 @@
       </w:pPr>
       <w:r>
         <w:rPr>
-          <w:color w:val="1F3B5C"/>
-          <w:sz w:val="24"/>
+          <w:rFonts w:ascii="Calibri" w:hAnsi="Calibri"/>
+          <w:color w:val="000000"/>
         </w:rPr>
         <w:t>3.2 Confidentiality</w:t>
       </w:r>
@@ -700,24 +706,36 @@
     <w:p>
       <w:pPr>
         <w:pStyle w:val="ListBullet"/>
+        <w:ind w:left="360"/>
       </w:pPr>
       <w:r>
+        <w:rPr>
+          <w:rFonts w:ascii="Calibri" w:hAnsi="Calibri"/>
+        </w:rPr>
         <w:t>All persons authorized to process Personal Data are bound by confidentiality obligations</w:t>
       </w:r>
     </w:p>
     <w:p>
       <w:pPr>
         <w:pStyle w:val="ListBullet"/>
+        <w:ind w:left="360"/>
       </w:pPr>
       <w:r>
+        <w:rPr>
+          <w:rFonts w:ascii="Calibri" w:hAnsi="Calibri"/>
+        </w:rPr>
         <w:t>Access to Personal Data is limited to authorized personnel only</w:t>
       </w:r>
     </w:p>
     <w:p>
       <w:pPr>
         <w:pStyle w:val="ListBullet"/>
+        <w:ind w:left="360"/>
       </w:pPr>
       <w:r>
+        <w:rPr>
+          <w:rFonts w:ascii="Calibri" w:hAnsi="Calibri"/>
+        </w:rPr>
         <w:t>Personal Data is not disclosed to unauthorized third parties</w:t>
       </w:r>
     </w:p>
@@ -727,133 +745,192 @@
       </w:pPr>
       <w:r>
         <w:rPr>
-          <w:color w:val="1F3B5C"/>
-          <w:sz w:val="24"/>
+          <w:rFonts w:ascii="Calibri" w:hAnsi="Calibri"/>
+          <w:color w:val="000000"/>
         </w:rPr>
         <w:t>3.3 Security Measures</w:t>
       </w:r>
     </w:p>
     <w:p>
       <w:r>
+        <w:rPr>
+          <w:rFonts w:ascii="Calibri" w:hAnsi="Calibri"/>
+        </w:rPr>
         <w:t>Neon shall implement:</w:t>
       </w:r>
     </w:p>
     <w:p>
       <w:pPr>
         <w:pStyle w:val="ListBullet"/>
+        <w:ind w:left="360"/>
       </w:pPr>
       <w:r>
-        <w:t xml:space="preserve">[ ] </w:t>
+        <w:rPr>
+          <w:rFonts w:ascii="Calibri" w:hAnsi="Calibri"/>
+        </w:rPr>
+        <w:t xml:space="preserve">☐ </w:t>
       </w:r>
       <w:r>
         <w:rPr>
+          <w:rFonts w:ascii="Calibri" w:hAnsi="Calibri"/>
           <w:b/>
         </w:rPr>
         <w:t>Encryption</w:t>
       </w:r>
       <w:r>
+        <w:rPr>
+          <w:rFonts w:ascii="Calibri" w:hAnsi="Calibri"/>
+        </w:rPr>
         <w:t xml:space="preserve"> — AES-256 encryption at rest; TLS 1.2+ in transit</w:t>
       </w:r>
     </w:p>
     <w:p>
       <w:pPr>
         <w:pStyle w:val="ListBullet"/>
+        <w:ind w:left="360"/>
       </w:pPr>
       <w:r>
-        <w:t xml:space="preserve">[ ] </w:t>
+        <w:rPr>
+          <w:rFonts w:ascii="Calibri" w:hAnsi="Calibri"/>
+        </w:rPr>
+        <w:t xml:space="preserve">☐ </w:t>
       </w:r>
       <w:r>
         <w:rPr>
+          <w:rFonts w:ascii="Calibri" w:hAnsi="Calibri"/>
           <w:b/>
         </w:rPr>
         <w:t>Access Controls</w:t>
       </w:r>
       <w:r>
+        <w:rPr>
+          <w:rFonts w:ascii="Calibri" w:hAnsi="Calibri"/>
+        </w:rPr>
         <w:t xml:space="preserve"> — Role-based access control (RBAC)</w:t>
       </w:r>
     </w:p>
     <w:p>
       <w:pPr>
         <w:pStyle w:val="ListBullet"/>
+        <w:ind w:left="360"/>
       </w:pPr>
       <w:r>
-        <w:t xml:space="preserve">[ ] </w:t>
+        <w:rPr>
+          <w:rFonts w:ascii="Calibri" w:hAnsi="Calibri"/>
+        </w:rPr>
+        <w:t xml:space="preserve">☐ </w:t>
       </w:r>
       <w:r>
         <w:rPr>
+          <w:rFonts w:ascii="Calibri" w:hAnsi="Calibri"/>
           <w:b/>
         </w:rPr>
         <w:t>Audit Logging</w:t>
       </w:r>
       <w:r>
+        <w:rPr>
+          <w:rFonts w:ascii="Calibri" w:hAnsi="Calibri"/>
+        </w:rPr>
         <w:t xml:space="preserve"> — All access to Personal Data is logged</w:t>
       </w:r>
     </w:p>
     <w:p>
       <w:pPr>
         <w:pStyle w:val="ListBullet"/>
+        <w:ind w:left="360"/>
       </w:pPr>
       <w:r>
-        <w:t xml:space="preserve">[ ] </w:t>
+        <w:rPr>
+          <w:rFonts w:ascii="Calibri" w:hAnsi="Calibri"/>
+        </w:rPr>
+        <w:t xml:space="preserve">☐ </w:t>
       </w:r>
       <w:r>
         <w:rPr>
+          <w:rFonts w:ascii="Calibri" w:hAnsi="Calibri"/>
           <w:b/>
         </w:rPr>
         <w:t>Vulnerability Management</w:t>
       </w:r>
       <w:r>
+        <w:rPr>
+          <w:rFonts w:ascii="Calibri" w:hAnsi="Calibri"/>
+        </w:rPr>
         <w:t xml:space="preserve"> — Regular security assessments</w:t>
       </w:r>
     </w:p>
     <w:p>
       <w:pPr>
         <w:pStyle w:val="ListBullet"/>
+        <w:ind w:left="360"/>
       </w:pPr>
       <w:r>
-        <w:t xml:space="preserve">[ ] </w:t>
+        <w:rPr>
+          <w:rFonts w:ascii="Calibri" w:hAnsi="Calibri"/>
+        </w:rPr>
+        <w:t xml:space="preserve">☐ </w:t>
       </w:r>
       <w:r>
         <w:rPr>
+          <w:rFonts w:ascii="Calibri" w:hAnsi="Calibri"/>
           <w:b/>
         </w:rPr>
         <w:t>Incident Response</w:t>
       </w:r>
       <w:r>
+        <w:rPr>
+          <w:rFonts w:ascii="Calibri" w:hAnsi="Calibri"/>
+        </w:rPr>
         <w:t xml:space="preserve"> — Documented breach notification procedures</w:t>
       </w:r>
     </w:p>
     <w:p>
       <w:pPr>
         <w:pStyle w:val="ListBullet"/>
+        <w:ind w:left="360"/>
       </w:pPr>
       <w:r>
-        <w:t xml:space="preserve">[ ] </w:t>
+        <w:rPr>
+          <w:rFonts w:ascii="Calibri" w:hAnsi="Calibri"/>
+        </w:rPr>
+        <w:t xml:space="preserve">☐ </w:t>
       </w:r>
       <w:r>
         <w:rPr>
+          <w:rFonts w:ascii="Calibri" w:hAnsi="Calibri"/>
           <w:b/>
         </w:rPr>
         <w:t>SOC 2 Type II Compliance</w:t>
       </w:r>
       <w:r>
+        <w:rPr>
+          <w:rFonts w:ascii="Calibri" w:hAnsi="Calibri"/>
+        </w:rPr>
         <w:t xml:space="preserve"> — Annual audit</w:t>
       </w:r>
     </w:p>
     <w:p>
       <w:pPr>
         <w:pStyle w:val="ListBullet"/>
+        <w:ind w:left="360"/>
       </w:pPr>
       <w:r>
-        <w:t xml:space="preserve">[ ] </w:t>
+        <w:rPr>
+          <w:rFonts w:ascii="Calibri" w:hAnsi="Calibri"/>
+        </w:rPr>
+        <w:t xml:space="preserve">☐ </w:t>
       </w:r>
       <w:r>
         <w:rPr>
+          <w:rFonts w:ascii="Calibri" w:hAnsi="Calibri"/>
           <w:b/>
         </w:rPr>
         <w:t>PCI DSS Compliance</w:t>
       </w:r>
       <w:r>
+        <w:rPr>
+          <w:rFonts w:ascii="Calibri" w:hAnsi="Calibri"/>
+        </w:rPr>
         <w:t xml:space="preserve"> — For payment-related data</w:t>
       </w:r>
     </w:p>
@@ -863,14 +940,17 @@
       </w:pPr>
       <w:r>
         <w:rPr>
-          <w:color w:val="1F3B5C"/>
-          <w:sz w:val="24"/>
+          <w:rFonts w:ascii="Calibri" w:hAnsi="Calibri"/>
+          <w:color w:val="000000"/>
         </w:rPr>
         <w:t>3.4 Sub-Processors</w:t>
       </w:r>
     </w:p>
     <w:p>
       <w:r>
+        <w:rPr>
+          <w:rFonts w:ascii="Calibri" w:hAnsi="Calibri"/>
+        </w:rPr>
         <w:t>Neon maintains a list of sub-processors. LINEKORA must be notified of any changes to the sub-processor list.</w:t>
       </w:r>
     </w:p>
@@ -880,8 +960,8 @@
       </w:pPr>
       <w:r>
         <w:rPr>
-          <w:color w:val="1F3B5C"/>
-          <w:sz w:val="24"/>
+          <w:rFonts w:ascii="Calibri" w:hAnsi="Calibri"/>
+          <w:color w:val="000000"/>
         </w:rPr>
         <w:t>3.5 Data Breach Notification</w:t>
       </w:r>
@@ -889,49 +969,71 @@
     <w:p>
       <w:pPr>
         <w:pStyle w:val="ListBullet"/>
+        <w:ind w:left="360"/>
       </w:pPr>
       <w:r>
+        <w:rPr>
+          <w:rFonts w:ascii="Calibri" w:hAnsi="Calibri"/>
+        </w:rPr>
         <w:t xml:space="preserve">Notify LINEKORA </w:t>
       </w:r>
       <w:r>
         <w:rPr>
+          <w:rFonts w:ascii="Calibri" w:hAnsi="Calibri"/>
           <w:b/>
         </w:rPr>
         <w:t>within 48 hours</w:t>
       </w:r>
       <w:r>
+        <w:rPr>
+          <w:rFonts w:ascii="Calibri" w:hAnsi="Calibri"/>
+        </w:rPr>
         <w:t xml:space="preserve"> of becoming aware of a Personal Data breach</w:t>
       </w:r>
     </w:p>
     <w:p>
       <w:pPr>
         <w:pStyle w:val="ListBullet"/>
+        <w:ind w:left="360"/>
       </w:pPr>
       <w:r>
+        <w:rPr>
+          <w:rFonts w:ascii="Calibri" w:hAnsi="Calibri"/>
+        </w:rPr>
         <w:t xml:space="preserve">Provide all information necessary for LINEKORA to comply with the </w:t>
       </w:r>
       <w:r>
         <w:rPr>
+          <w:rFonts w:ascii="Calibri" w:hAnsi="Calibri"/>
           <w:b/>
         </w:rPr>
         <w:t>72-hour breach notification</w:t>
       </w:r>
       <w:r>
+        <w:rPr>
+          <w:rFonts w:ascii="Calibri" w:hAnsi="Calibri"/>
+        </w:rPr>
         <w:t xml:space="preserve"> requirement under Rwanda's PDPB</w:t>
       </w:r>
     </w:p>
     <w:p>
       <w:pPr>
         <w:pStyle w:val="ListBullet"/>
+        <w:ind w:left="360"/>
       </w:pPr>
       <w:r>
+        <w:rPr>
+          <w:rFonts w:ascii="Calibri" w:hAnsi="Calibri"/>
+        </w:rPr>
         <w:t>Take immediate steps to contain and remediate the breach</w:t>
       </w:r>
     </w:p>
     <w:p>
-      <w:r>
-        <w:t>______________________________</w:t>
-      </w:r>
+      <w:pPr>
+        <w:pBdr>
+          <w:bottom w:val="single" w:sz="6" w:space="1" w:color="666666"/>
+        </w:pBdr>
+      </w:pPr>
     </w:p>
     <w:p>
       <w:pPr>
@@ -939,8 +1041,8 @@
       </w:pPr>
       <w:r>
         <w:rPr>
-          <w:color w:val="1F3B5C"/>
-          <w:sz w:val="30"/>
+          <w:rFonts w:ascii="Calibri" w:hAnsi="Calibri"/>
+          <w:color w:val="000000"/>
         </w:rPr>
         <w:t>4. CROSS-BORDER DATA TRANSFERS</w:t>
       </w:r>
@@ -951,8 +1053,8 @@
       </w:pPr>
       <w:r>
         <w:rPr>
-          <w:color w:val="1F3B5C"/>
-          <w:sz w:val="24"/>
+          <w:rFonts w:ascii="Calibri" w:hAnsi="Calibri"/>
+          <w:color w:val="000000"/>
         </w:rPr>
         <w:t>4.1 Processor Location</w:t>
       </w:r>
@@ -961,7 +1063,6 @@
       <w:tblPr>
         <w:tblStyle w:val="TableGrid"/>
         <w:tblW w:type="auto" w:w="0"/>
-        <w:jc w:val="center"/>
         <w:tblLook w:firstColumn="1" w:firstRow="1" w:lastColumn="0" w:lastRow="0" w:noHBand="0" w:noVBand="1" w:val="04A0"/>
       </w:tblPr>
       <w:tblGrid>
@@ -974,21 +1075,13 @@
         <w:tc>
           <w:tcPr>
             <w:tcW w:type="dxa" w:w="2160"/>
-            <w:shd w:val="clear" w:color="auto" w:fill="1F3B5C"/>
           </w:tcPr>
           <w:p>
+            <w:r/>
             <w:r>
               <w:rPr>
+                <w:rFonts w:ascii="Calibri" w:hAnsi="Calibri"/>
                 <w:b/>
-                <w:color w:val="FFFFFF"/>
-                <w:sz w:val="18"/>
-              </w:rPr>
-            </w:r>
-            <w:r>
-              <w:rPr>
-                <w:b/>
-                <w:color w:val="FFFFFF"/>
-                <w:sz w:val="18"/>
               </w:rPr>
               <w:t>Processor</w:t>
             </w:r>
@@ -997,21 +1090,13 @@
         <w:tc>
           <w:tcPr>
             <w:tcW w:type="dxa" w:w="2160"/>
-            <w:shd w:val="clear" w:color="auto" w:fill="1F3B5C"/>
           </w:tcPr>
           <w:p>
+            <w:r/>
             <w:r>
               <w:rPr>
+                <w:rFonts w:ascii="Calibri" w:hAnsi="Calibri"/>
                 <w:b/>
-                <w:color w:val="FFFFFF"/>
-                <w:sz w:val="18"/>
-              </w:rPr>
-            </w:r>
-            <w:r>
-              <w:rPr>
-                <w:b/>
-                <w:color w:val="FFFFFF"/>
-                <w:sz w:val="18"/>
               </w:rPr>
               <w:t>Location</w:t>
             </w:r>
@@ -1020,21 +1105,13 @@
         <w:tc>
           <w:tcPr>
             <w:tcW w:type="dxa" w:w="2160"/>
-            <w:shd w:val="clear" w:color="auto" w:fill="1F3B5C"/>
           </w:tcPr>
           <w:p>
+            <w:r/>
             <w:r>
               <w:rPr>
+                <w:rFonts w:ascii="Calibri" w:hAnsi="Calibri"/>
                 <w:b/>
-                <w:color w:val="FFFFFF"/>
-                <w:sz w:val="18"/>
-              </w:rPr>
-            </w:r>
-            <w:r>
-              <w:rPr>
-                <w:b/>
-                <w:color w:val="FFFFFF"/>
-                <w:sz w:val="18"/>
               </w:rPr>
               <w:t>Data Stored</w:t>
             </w:r>
@@ -1043,21 +1120,13 @@
         <w:tc>
           <w:tcPr>
             <w:tcW w:type="dxa" w:w="2160"/>
-            <w:shd w:val="clear" w:color="auto" w:fill="1F3B5C"/>
           </w:tcPr>
           <w:p>
+            <w:r/>
             <w:r>
               <w:rPr>
+                <w:rFonts w:ascii="Calibri" w:hAnsi="Calibri"/>
                 <w:b/>
-                <w:color w:val="FFFFFF"/>
-                <w:sz w:val="18"/>
-              </w:rPr>
-            </w:r>
-            <w:r>
-              <w:rPr>
-                <w:b/>
-                <w:color w:val="FFFFFF"/>
-                <w:sz w:val="18"/>
               </w:rPr>
               <w:t>Transfer Mechanism</w:t>
             </w:r>
@@ -1070,16 +1139,12 @@
             <w:tcW w:type="dxa" w:w="2160"/>
           </w:tcPr>
           <w:p>
+            <w:r/>
             <w:r>
               <w:rPr>
-                <w:sz w:val="18"/>
+                <w:rFonts w:ascii="Calibri" w:hAnsi="Calibri"/>
               </w:rPr>
-            </w:r>
-            <w:r>
-              <w:rPr>
-                <w:sz w:val="18"/>
-              </w:rPr>
-              <w:t>NeonDB</w:t>
+              <w:t>NeonDB (Neon)</w:t>
             </w:r>
           </w:p>
         </w:tc>
@@ -1088,16 +1153,19 @@
             <w:tcW w:type="dxa" w:w="2160"/>
           </w:tcPr>
           <w:p>
+            <w:r/>
             <w:r>
               <w:rPr>
-                <w:sz w:val="18"/>
+                <w:rFonts w:ascii="Calibri" w:hAnsi="Calibri"/>
+                <w:b/>
               </w:rPr>
+              <w:t>AWS us-east-1, N. Virginia, USA</w:t>
             </w:r>
             <w:r>
               <w:rPr>
-                <w:sz w:val="18"/>
+                <w:rFonts w:ascii="Calibri" w:hAnsi="Calibri"/>
               </w:rPr>
-              <w:t>US / EU (multi-region)</w:t>
+              <w:t xml:space="preserve"> (confirmed)</w:t>
             </w:r>
           </w:p>
         </w:tc>
@@ -1106,14 +1174,10 @@
             <w:tcW w:type="dxa" w:w="2160"/>
           </w:tcPr>
           <w:p>
+            <w:r/>
             <w:r>
               <w:rPr>
-                <w:sz w:val="18"/>
-              </w:rPr>
-            </w:r>
-            <w:r>
-              <w:rPr>
-                <w:sz w:val="18"/>
+                <w:rFonts w:ascii="Calibri" w:hAnsi="Calibri"/>
               </w:rPr>
               <w:t>All PII, Task data, Transactions</w:t>
             </w:r>
@@ -1124,14 +1188,10 @@
             <w:tcW w:type="dxa" w:w="2160"/>
           </w:tcPr>
           <w:p>
+            <w:r/>
             <w:r>
               <w:rPr>
-                <w:sz w:val="18"/>
-              </w:rPr>
-            </w:r>
-            <w:r>
-              <w:rPr>
-                <w:sz w:val="18"/>
+                <w:rFonts w:ascii="Calibri" w:hAnsi="Calibri"/>
               </w:rPr>
               <w:t>Standard Contractual Clauses (SCCs)</w:t>
             </w:r>
@@ -1142,50 +1202,131 @@
     <w:p/>
     <w:p>
       <w:pPr>
+        <w:shd w:val="clear" w:color="auto" w:fill="F2F2F2"/>
+      </w:pPr>
+      <w:r>
+        <w:rPr>
+          <w:rFonts w:ascii="Calibri" w:hAnsi="Calibri"/>
+          <w:b/>
+          <w:sz w:val="20"/>
+        </w:rPr>
+        <w:t>Confirmed (Sept 14, 2026):</w:t>
+      </w:r>
+      <w:r>
+        <w:rPr>
+          <w:rFonts w:ascii="Calibri" w:hAnsi="Calibri"/>
+          <w:sz w:val="20"/>
+        </w:rPr>
+        <w:t xml:space="preserve"> Production database is Neon at </w:t>
+      </w:r>
+      <w:r>
+        <w:rPr>
+          <w:rFonts w:ascii="Calibri" w:hAnsi="Calibri"/>
+          <w:sz w:val="20"/>
+        </w:rPr>
+        <w:t>ep-tiny-lab-at67jz3u.c-9.us-east-1.aws.neon.tech</w:t>
+      </w:r>
+      <w:r>
+        <w:rPr>
+          <w:rFonts w:ascii="Calibri" w:hAnsi="Calibri"/>
+          <w:sz w:val="20"/>
+        </w:rPr>
+        <w:t xml:space="preserve">, database </w:t>
+      </w:r>
+      <w:r>
+        <w:rPr>
+          <w:rFonts w:ascii="Calibri" w:hAnsi="Calibri"/>
+          <w:sz w:val="20"/>
+        </w:rPr>
+        <w:t>neondb</w:t>
+      </w:r>
+      <w:r>
+        <w:rPr>
+          <w:rFonts w:ascii="Calibri" w:hAnsi="Calibri"/>
+          <w:sz w:val="20"/>
+        </w:rPr>
+        <w:t xml:space="preserve">, connection uses </w:t>
+      </w:r>
+      <w:r>
+        <w:rPr>
+          <w:rFonts w:ascii="Calibri" w:hAnsi="Calibri"/>
+          <w:sz w:val="20"/>
+        </w:rPr>
+        <w:t>sslmode=require</w:t>
+      </w:r>
+      <w:r>
+        <w:rPr>
+          <w:rFonts w:ascii="Calibri" w:hAnsi="Calibri"/>
+          <w:sz w:val="20"/>
+        </w:rPr>
+        <w:t xml:space="preserve"> (TLS enforced).</w:t>
+      </w:r>
+    </w:p>
+    <w:p>
+      <w:pPr>
         <w:pStyle w:val="Heading3"/>
       </w:pPr>
       <w:r>
         <w:rPr>
-          <w:color w:val="1F3B5C"/>
-          <w:sz w:val="24"/>
+          <w:rFonts w:ascii="Calibri" w:hAnsi="Calibri"/>
+          <w:color w:val="000000"/>
         </w:rPr>
         <w:t>4.2 Safeguards</w:t>
       </w:r>
     </w:p>
     <w:p>
       <w:r>
+        <w:rPr>
+          <w:rFonts w:ascii="Calibri" w:hAnsi="Calibri"/>
+        </w:rPr>
         <w:t>Neon shall ensure that any cross-border transfer of Personal Data is protected by:</w:t>
       </w:r>
     </w:p>
     <w:p>
       <w:pPr>
         <w:pStyle w:val="ListBullet"/>
+        <w:ind w:left="360"/>
       </w:pPr>
       <w:r>
+        <w:rPr>
+          <w:rFonts w:ascii="Calibri" w:hAnsi="Calibri"/>
+        </w:rPr>
         <w:t>Standard Contractual Clauses (SCCs)</w:t>
       </w:r>
     </w:p>
     <w:p>
       <w:pPr>
         <w:pStyle w:val="ListBullet"/>
+        <w:ind w:left="360"/>
       </w:pPr>
       <w:r>
+        <w:rPr>
+          <w:rFonts w:ascii="Calibri" w:hAnsi="Calibri"/>
+        </w:rPr>
         <w:t>Encryption at rest (AES-256) and in transit (TLS 1.2+)</w:t>
       </w:r>
     </w:p>
     <w:p>
       <w:pPr>
         <w:pStyle w:val="ListBullet"/>
+        <w:ind w:left="360"/>
       </w:pPr>
       <w:r>
+        <w:rPr>
+          <w:rFonts w:ascii="Calibri" w:hAnsi="Calibri"/>
+        </w:rPr>
         <w:t>Regional data isolation options</w:t>
       </w:r>
     </w:p>
     <w:p>
       <w:pPr>
         <w:pStyle w:val="ListBullet"/>
+        <w:ind w:left="360"/>
       </w:pPr>
       <w:r>
+        <w:rPr>
+          <w:rFonts w:ascii="Calibri" w:hAnsi="Calibri"/>
+        </w:rPr>
         <w:t>Regular security audits</w:t>
       </w:r>
     </w:p>
@@ -1195,39 +1336,52 @@
       </w:pPr>
       <w:r>
         <w:rPr>
-          <w:color w:val="1F3B5C"/>
-          <w:sz w:val="24"/>
+          <w:rFonts w:ascii="Calibri" w:hAnsi="Calibri"/>
+          <w:color w:val="000000"/>
         </w:rPr>
         <w:t>4.3 International Storage Authorization</w:t>
       </w:r>
     </w:p>
     <w:p>
       <w:r>
+        <w:rPr>
+          <w:rFonts w:ascii="Calibri" w:hAnsi="Calibri"/>
+        </w:rPr>
         <w:t xml:space="preserve">Neon acknowledges that Personal Data is stored and processed </w:t>
       </w:r>
       <w:r>
         <w:rPr>
+          <w:rFonts w:ascii="Calibri" w:hAnsi="Calibri"/>
           <w:b/>
         </w:rPr>
         <w:t>outside of Rwanda</w:t>
       </w:r>
       <w:r>
+        <w:rPr>
+          <w:rFonts w:ascii="Calibri" w:hAnsi="Calibri"/>
+        </w:rPr>
         <w:t xml:space="preserve"> and that such transfer requires authorization from the </w:t>
       </w:r>
       <w:r>
         <w:rPr>
+          <w:rFonts w:ascii="Calibri" w:hAnsi="Calibri"/>
           <w:b/>
         </w:rPr>
         <w:t>Rwanda Data Protection Authority</w:t>
       </w:r>
       <w:r>
+        <w:rPr>
+          <w:rFonts w:ascii="Calibri" w:hAnsi="Calibri"/>
+        </w:rPr>
         <w:t>. LINEKORA shall obtain this authorization before activating Neon services.</w:t>
       </w:r>
     </w:p>
     <w:p>
-      <w:r>
-        <w:t>______________________________</w:t>
-      </w:r>
+      <w:pPr>
+        <w:pBdr>
+          <w:bottom w:val="single" w:sz="6" w:space="1" w:color="666666"/>
+        </w:pBdr>
+      </w:pPr>
     </w:p>
     <w:p>
       <w:pPr>
@@ -1235,8 +1389,8 @@
       </w:pPr>
       <w:r>
         <w:rPr>
-          <w:color w:val="1F3B5C"/>
-          <w:sz w:val="30"/>
+          <w:rFonts w:ascii="Calibri" w:hAnsi="Calibri"/>
+          <w:color w:val="000000"/>
         </w:rPr>
         <w:t>5. DATA RETENTION AND DELETION</w:t>
       </w:r>
@@ -1245,7 +1399,6 @@
       <w:tblPr>
         <w:tblStyle w:val="TableGrid"/>
         <w:tblW w:type="auto" w:w="0"/>
-        <w:jc w:val="center"/>
         <w:tblLook w:firstColumn="1" w:firstRow="1" w:lastColumn="0" w:lastRow="0" w:noHBand="0" w:noVBand="1" w:val="04A0"/>
       </w:tblPr>
       <w:tblGrid>
@@ -1257,21 +1410,13 @@
         <w:tc>
           <w:tcPr>
             <w:tcW w:type="dxa" w:w="2880"/>
-            <w:shd w:val="clear" w:color="auto" w:fill="1F3B5C"/>
           </w:tcPr>
           <w:p>
+            <w:r/>
             <w:r>
               <w:rPr>
+                <w:rFonts w:ascii="Calibri" w:hAnsi="Calibri"/>
                 <w:b/>
-                <w:color w:val="FFFFFF"/>
-                <w:sz w:val="18"/>
-              </w:rPr>
-            </w:r>
-            <w:r>
-              <w:rPr>
-                <w:b/>
-                <w:color w:val="FFFFFF"/>
-                <w:sz w:val="18"/>
               </w:rPr>
               <w:t>Data Type</w:t>
             </w:r>
@@ -1280,21 +1425,13 @@
         <w:tc>
           <w:tcPr>
             <w:tcW w:type="dxa" w:w="2880"/>
-            <w:shd w:val="clear" w:color="auto" w:fill="1F3B5C"/>
           </w:tcPr>
           <w:p>
+            <w:r/>
             <w:r>
               <w:rPr>
+                <w:rFonts w:ascii="Calibri" w:hAnsi="Calibri"/>
                 <w:b/>
-                <w:color w:val="FFFFFF"/>
-                <w:sz w:val="18"/>
-              </w:rPr>
-            </w:r>
-            <w:r>
-              <w:rPr>
-                <w:b/>
-                <w:color w:val="FFFFFF"/>
-                <w:sz w:val="18"/>
               </w:rPr>
               <w:t>Retention Period</w:t>
             </w:r>
@@ -1303,21 +1440,13 @@
         <w:tc>
           <w:tcPr>
             <w:tcW w:type="dxa" w:w="2880"/>
-            <w:shd w:val="clear" w:color="auto" w:fill="1F3B5C"/>
           </w:tcPr>
           <w:p>
+            <w:r/>
             <w:r>
               <w:rPr>
+                <w:rFonts w:ascii="Calibri" w:hAnsi="Calibri"/>
                 <w:b/>
-                <w:color w:val="FFFFFF"/>
-                <w:sz w:val="18"/>
-              </w:rPr>
-            </w:r>
-            <w:r>
-              <w:rPr>
-                <w:b/>
-                <w:color w:val="FFFFFF"/>
-                <w:sz w:val="18"/>
               </w:rPr>
               <w:t>Deletion Method</w:t>
             </w:r>
@@ -1330,14 +1459,10 @@
             <w:tcW w:type="dxa" w:w="2880"/>
           </w:tcPr>
           <w:p>
+            <w:r/>
             <w:r>
               <w:rPr>
-                <w:sz w:val="18"/>
-              </w:rPr>
-            </w:r>
-            <w:r>
-              <w:rPr>
-                <w:sz w:val="18"/>
+                <w:rFonts w:ascii="Calibri" w:hAnsi="Calibri"/>
               </w:rPr>
               <w:t>Worker PII</w:t>
             </w:r>
@@ -1348,14 +1473,10 @@
             <w:tcW w:type="dxa" w:w="2880"/>
           </w:tcPr>
           <w:p>
+            <w:r/>
             <w:r>
               <w:rPr>
-                <w:sz w:val="18"/>
-              </w:rPr>
-            </w:r>
-            <w:r>
-              <w:rPr>
-                <w:sz w:val="18"/>
+                <w:rFonts w:ascii="Calibri" w:hAnsi="Calibri"/>
               </w:rPr>
               <w:t>Active account + 2 years</w:t>
             </w:r>
@@ -1366,73 +1487,10 @@
             <w:tcW w:type="dxa" w:w="2880"/>
           </w:tcPr>
           <w:p>
+            <w:r/>
             <w:r>
               <w:rPr>
-                <w:sz w:val="18"/>
-              </w:rPr>
-            </w:r>
-            <w:r>
-              <w:rPr>
-                <w:sz w:val="18"/>
-              </w:rPr>
-              <w:t>Secure deletion</w:t>
-            </w:r>
-          </w:p>
-        </w:tc>
-      </w:tr>
-      <w:tr>
-        <w:tc>
-          <w:tcPr>
-            <w:tcW w:type="dxa" w:w="2880"/>
-            <w:shd w:val="clear" w:color="auto" w:fill="EAF1F8"/>
-          </w:tcPr>
-          <w:p>
-            <w:r>
-              <w:rPr>
-                <w:sz w:val="18"/>
-              </w:rPr>
-            </w:r>
-            <w:r>
-              <w:rPr>
-                <w:sz w:val="18"/>
-              </w:rPr>
-              <w:t>Employer PII</w:t>
-            </w:r>
-          </w:p>
-        </w:tc>
-        <w:tc>
-          <w:tcPr>
-            <w:tcW w:type="dxa" w:w="2880"/>
-            <w:shd w:val="clear" w:color="auto" w:fill="EAF1F8"/>
-          </w:tcPr>
-          <w:p>
-            <w:r>
-              <w:rPr>
-                <w:sz w:val="18"/>
-              </w:rPr>
-            </w:r>
-            <w:r>
-              <w:rPr>
-                <w:sz w:val="18"/>
-              </w:rPr>
-              <w:t>Active account + 2 years</w:t>
-            </w:r>
-          </w:p>
-        </w:tc>
-        <w:tc>
-          <w:tcPr>
-            <w:tcW w:type="dxa" w:w="2880"/>
-            <w:shd w:val="clear" w:color="auto" w:fill="EAF1F8"/>
-          </w:tcPr>
-          <w:p>
-            <w:r>
-              <w:rPr>
-                <w:sz w:val="18"/>
-              </w:rPr>
-            </w:r>
-            <w:r>
-              <w:rPr>
-                <w:sz w:val="18"/>
+                <w:rFonts w:ascii="Calibri" w:hAnsi="Calibri"/>
               </w:rPr>
               <w:t>Secure deletion</w:t>
             </w:r>
@@ -1445,14 +1503,54 @@
             <w:tcW w:type="dxa" w:w="2880"/>
           </w:tcPr>
           <w:p>
+            <w:r/>
             <w:r>
               <w:rPr>
-                <w:sz w:val="18"/>
+                <w:rFonts w:ascii="Calibri" w:hAnsi="Calibri"/>
               </w:rPr>
+              <w:t>Employer PII</w:t>
             </w:r>
+          </w:p>
+        </w:tc>
+        <w:tc>
+          <w:tcPr>
+            <w:tcW w:type="dxa" w:w="2880"/>
+          </w:tcPr>
+          <w:p>
+            <w:r/>
             <w:r>
               <w:rPr>
-                <w:sz w:val="18"/>
+                <w:rFonts w:ascii="Calibri" w:hAnsi="Calibri"/>
+              </w:rPr>
+              <w:t>Active account + 2 years</w:t>
+            </w:r>
+          </w:p>
+        </w:tc>
+        <w:tc>
+          <w:tcPr>
+            <w:tcW w:type="dxa" w:w="2880"/>
+          </w:tcPr>
+          <w:p>
+            <w:r/>
+            <w:r>
+              <w:rPr>
+                <w:rFonts w:ascii="Calibri" w:hAnsi="Calibri"/>
+              </w:rPr>
+              <w:t>Secure deletion</w:t>
+            </w:r>
+          </w:p>
+        </w:tc>
+      </w:tr>
+      <w:tr>
+        <w:tc>
+          <w:tcPr>
+            <w:tcW w:type="dxa" w:w="2880"/>
+          </w:tcPr>
+          <w:p>
+            <w:r/>
+            <w:r>
+              <w:rPr>
+                <w:rFonts w:ascii="Calibri" w:hAnsi="Calibri"/>
               </w:rPr>
               <w:t>Task data</w:t>
             </w:r>
@@ -1463,14 +1561,10 @@
             <w:tcW w:type="dxa" w:w="2880"/>
           </w:tcPr>
           <w:p>
+            <w:r/>
             <w:r>
               <w:rPr>
-                <w:sz w:val="18"/>
-              </w:rPr>
-            </w:r>
-            <w:r>
-              <w:rPr>
-                <w:sz w:val="18"/>
+                <w:rFonts w:ascii="Calibri" w:hAnsi="Calibri"/>
               </w:rPr>
               <w:t>7 years (legal requirement)</w:t>
             </w:r>
@@ -1481,73 +1575,10 @@
             <w:tcW w:type="dxa" w:w="2880"/>
           </w:tcPr>
           <w:p>
+            <w:r/>
             <w:r>
               <w:rPr>
-                <w:sz w:val="18"/>
-              </w:rPr>
-            </w:r>
-            <w:r>
-              <w:rPr>
-                <w:sz w:val="18"/>
-              </w:rPr>
-              <w:t>Archive then delete</w:t>
-            </w:r>
-          </w:p>
-        </w:tc>
-      </w:tr>
-      <w:tr>
-        <w:tc>
-          <w:tcPr>
-            <w:tcW w:type="dxa" w:w="2880"/>
-            <w:shd w:val="clear" w:color="auto" w:fill="EAF1F8"/>
-          </w:tcPr>
-          <w:p>
-            <w:r>
-              <w:rPr>
-                <w:sz w:val="18"/>
-              </w:rPr>
-            </w:r>
-            <w:r>
-              <w:rPr>
-                <w:sz w:val="18"/>
-              </w:rPr>
-              <w:t>Transaction records</w:t>
-            </w:r>
-          </w:p>
-        </w:tc>
-        <w:tc>
-          <w:tcPr>
-            <w:tcW w:type="dxa" w:w="2880"/>
-            <w:shd w:val="clear" w:color="auto" w:fill="EAF1F8"/>
-          </w:tcPr>
-          <w:p>
-            <w:r>
-              <w:rPr>
-                <w:sz w:val="18"/>
-              </w:rPr>
-            </w:r>
-            <w:r>
-              <w:rPr>
-                <w:sz w:val="18"/>
-              </w:rPr>
-              <w:t>7 years (legal requirement)</w:t>
-            </w:r>
-          </w:p>
-        </w:tc>
-        <w:tc>
-          <w:tcPr>
-            <w:tcW w:type="dxa" w:w="2880"/>
-            <w:shd w:val="clear" w:color="auto" w:fill="EAF1F8"/>
-          </w:tcPr>
-          <w:p>
-            <w:r>
-              <w:rPr>
-                <w:sz w:val="18"/>
-              </w:rPr>
-            </w:r>
-            <w:r>
-              <w:rPr>
-                <w:sz w:val="18"/>
+                <w:rFonts w:ascii="Calibri" w:hAnsi="Calibri"/>
               </w:rPr>
               <w:t>Archive then delete</w:t>
             </w:r>
@@ -1560,14 +1591,54 @@
             <w:tcW w:type="dxa" w:w="2880"/>
           </w:tcPr>
           <w:p>
+            <w:r/>
             <w:r>
               <w:rPr>
-                <w:sz w:val="18"/>
+                <w:rFonts w:ascii="Calibri" w:hAnsi="Calibri"/>
               </w:rPr>
+              <w:t>Transaction records</w:t>
             </w:r>
+          </w:p>
+        </w:tc>
+        <w:tc>
+          <w:tcPr>
+            <w:tcW w:type="dxa" w:w="2880"/>
+          </w:tcPr>
+          <w:p>
+            <w:r/>
             <w:r>
               <w:rPr>
-                <w:sz w:val="18"/>
+                <w:rFonts w:ascii="Calibri" w:hAnsi="Calibri"/>
+              </w:rPr>
+              <w:t>7 years (legal requirement)</w:t>
+            </w:r>
+          </w:p>
+        </w:tc>
+        <w:tc>
+          <w:tcPr>
+            <w:tcW w:type="dxa" w:w="2880"/>
+          </w:tcPr>
+          <w:p>
+            <w:r/>
+            <w:r>
+              <w:rPr>
+                <w:rFonts w:ascii="Calibri" w:hAnsi="Calibri"/>
+              </w:rPr>
+              <w:t>Archive then delete</w:t>
+            </w:r>
+          </w:p>
+        </w:tc>
+      </w:tr>
+      <w:tr>
+        <w:tc>
+          <w:tcPr>
+            <w:tcW w:type="dxa" w:w="2880"/>
+          </w:tcPr>
+          <w:p>
+            <w:r/>
+            <w:r>
+              <w:rPr>
+                <w:rFonts w:ascii="Calibri" w:hAnsi="Calibri"/>
               </w:rPr>
               <w:t>Support tickets</w:t>
             </w:r>
@@ -1578,14 +1649,10 @@
             <w:tcW w:type="dxa" w:w="2880"/>
           </w:tcPr>
           <w:p>
+            <w:r/>
             <w:r>
               <w:rPr>
-                <w:sz w:val="18"/>
-              </w:rPr>
-            </w:r>
-            <w:r>
-              <w:rPr>
-                <w:sz w:val="18"/>
+                <w:rFonts w:ascii="Calibri" w:hAnsi="Calibri"/>
               </w:rPr>
               <w:t>Resolution + 1 year</w:t>
             </w:r>
@@ -1596,14 +1663,10 @@
             <w:tcW w:type="dxa" w:w="2880"/>
           </w:tcPr>
           <w:p>
+            <w:r/>
             <w:r>
               <w:rPr>
-                <w:sz w:val="18"/>
-              </w:rPr>
-            </w:r>
-            <w:r>
-              <w:rPr>
-                <w:sz w:val="18"/>
+                <w:rFonts w:ascii="Calibri" w:hAnsi="Calibri"/>
               </w:rPr>
               <w:t>Secure deletion</w:t>
             </w:r>
@@ -1613,9 +1676,11 @@
     </w:tbl>
     <w:p/>
     <w:p>
-      <w:r>
-        <w:t>______________________________</w:t>
-      </w:r>
+      <w:pPr>
+        <w:pBdr>
+          <w:bottom w:val="single" w:sz="6" w:space="1" w:color="666666"/>
+        </w:pBdr>
+      </w:pPr>
     </w:p>
     <w:p>
       <w:pPr>
@@ -1623,53 +1688,74 @@
       </w:pPr>
       <w:r>
         <w:rPr>
-          <w:color w:val="1F3B5C"/>
-          <w:sz w:val="30"/>
+          <w:rFonts w:ascii="Calibri" w:hAnsi="Calibri"/>
+          <w:color w:val="000000"/>
         </w:rPr>
         <w:t>6. AUDIT RIGHTS</w:t>
       </w:r>
     </w:p>
     <w:p>
       <w:r>
+        <w:rPr>
+          <w:rFonts w:ascii="Calibri" w:hAnsi="Calibri"/>
+        </w:rPr>
         <w:t>LINEKORA (or its authorized auditor) shall have the right to:</w:t>
       </w:r>
     </w:p>
     <w:p>
       <w:pPr>
         <w:pStyle w:val="ListBullet"/>
+        <w:ind w:left="360"/>
       </w:pPr>
       <w:r>
+        <w:rPr>
+          <w:rFonts w:ascii="Calibri" w:hAnsi="Calibri"/>
+        </w:rPr>
         <w:t>Conduct audits of Neon's data processing activities</w:t>
       </w:r>
     </w:p>
     <w:p>
       <w:pPr>
         <w:pStyle w:val="ListBullet"/>
+        <w:ind w:left="360"/>
       </w:pPr>
       <w:r>
+        <w:rPr>
+          <w:rFonts w:ascii="Calibri" w:hAnsi="Calibri"/>
+        </w:rPr>
         <w:t>Request documentation and evidence of compliance</w:t>
       </w:r>
     </w:p>
     <w:p>
       <w:pPr>
         <w:pStyle w:val="ListBullet"/>
+        <w:ind w:left="360"/>
       </w:pPr>
       <w:r>
+        <w:rPr>
+          <w:rFonts w:ascii="Calibri" w:hAnsi="Calibri"/>
+        </w:rPr>
         <w:t>Inspect security measures and facilities</w:t>
       </w:r>
     </w:p>
     <w:p>
       <w:pPr>
         <w:pStyle w:val="ListBullet"/>
+        <w:ind w:left="360"/>
       </w:pPr>
       <w:r>
+        <w:rPr>
+          <w:rFonts w:ascii="Calibri" w:hAnsi="Calibri"/>
+        </w:rPr>
         <w:t>Request backup and recovery records</w:t>
       </w:r>
     </w:p>
     <w:p>
-      <w:r>
-        <w:t>______________________________</w:t>
-      </w:r>
+      <w:pPr>
+        <w:pBdr>
+          <w:bottom w:val="single" w:sz="6" w:space="1" w:color="666666"/>
+        </w:pBdr>
+      </w:pPr>
     </w:p>
     <w:p>
       <w:pPr>
@@ -1677,8 +1763,8 @@
       </w:pPr>
       <w:r>
         <w:rPr>
-          <w:color w:val="1F3B5C"/>
-          <w:sz w:val="30"/>
+          <w:rFonts w:ascii="Calibri" w:hAnsi="Calibri"/>
+          <w:color w:val="000000"/>
         </w:rPr>
         <w:t>7. SIGNATURES</w:t>
       </w:r>
@@ -1689,17 +1775,16 @@
       </w:pPr>
       <w:r>
         <w:rPr>
-          <w:color w:val="1F3B5C"/>
-          <w:sz w:val="24"/>
+          <w:rFonts w:ascii="Calibri" w:hAnsi="Calibri"/>
+          <w:color w:val="000000"/>
         </w:rPr>
-        <w:t>Data Controller: LINEKORA</w:t>
+        <w:t>Data Controller: NDIVE LABS LTD (LINEKORA)</w:t>
       </w:r>
     </w:p>
     <w:tbl>
       <w:tblPr>
         <w:tblStyle w:val="TableGrid"/>
         <w:tblW w:type="auto" w:w="0"/>
-        <w:jc w:val="center"/>
         <w:tblLook w:firstColumn="1" w:firstRow="1" w:lastColumn="0" w:lastRow="0" w:noHBand="0" w:noVBand="1" w:val="04A0"/>
       </w:tblPr>
       <w:tblGrid>
@@ -1710,21 +1795,13 @@
         <w:tc>
           <w:tcPr>
             <w:tcW w:type="dxa" w:w="4320"/>
-            <w:shd w:val="clear" w:color="auto" w:fill="1F3B5C"/>
           </w:tcPr>
           <w:p>
+            <w:r/>
             <w:r>
               <w:rPr>
+                <w:rFonts w:ascii="Calibri" w:hAnsi="Calibri"/>
                 <w:b/>
-                <w:color w:val="FFFFFF"/>
-                <w:sz w:val="18"/>
-              </w:rPr>
-            </w:r>
-            <w:r>
-              <w:rPr>
-                <w:b/>
-                <w:color w:val="FFFFFF"/>
-                <w:sz w:val="18"/>
               </w:rPr>
               <w:t>Field</w:t>
             </w:r>
@@ -1733,21 +1810,13 @@
         <w:tc>
           <w:tcPr>
             <w:tcW w:type="dxa" w:w="4320"/>
-            <w:shd w:val="clear" w:color="auto" w:fill="1F3B5C"/>
           </w:tcPr>
           <w:p>
+            <w:r/>
             <w:r>
               <w:rPr>
+                <w:rFonts w:ascii="Calibri" w:hAnsi="Calibri"/>
                 <w:b/>
-                <w:color w:val="FFFFFF"/>
-                <w:sz w:val="18"/>
-              </w:rPr>
-            </w:r>
-            <w:r>
-              <w:rPr>
-                <w:b/>
-                <w:color w:val="FFFFFF"/>
-                <w:sz w:val="18"/>
               </w:rPr>
               <w:t>Details</w:t>
             </w:r>
@@ -1760,14 +1829,10 @@
             <w:tcW w:type="dxa" w:w="4320"/>
           </w:tcPr>
           <w:p>
+            <w:r/>
             <w:r>
               <w:rPr>
-                <w:sz w:val="18"/>
-              </w:rPr>
-            </w:r>
-            <w:r>
-              <w:rPr>
-                <w:sz w:val="18"/>
+                <w:rFonts w:ascii="Calibri" w:hAnsi="Calibri"/>
               </w:rPr>
               <w:t>Name</w:t>
             </w:r>
@@ -1778,54 +1843,10 @@
             <w:tcW w:type="dxa" w:w="4320"/>
           </w:tcPr>
           <w:p>
+            <w:r/>
             <w:r>
               <w:rPr>
-                <w:sz w:val="18"/>
-              </w:rPr>
-            </w:r>
-            <w:r>
-              <w:rPr>
-                <w:sz w:val="18"/>
-              </w:rPr>
-              <w:t>_________________________</w:t>
-            </w:r>
-          </w:p>
-        </w:tc>
-      </w:tr>
-      <w:tr>
-        <w:tc>
-          <w:tcPr>
-            <w:tcW w:type="dxa" w:w="4320"/>
-            <w:shd w:val="clear" w:color="auto" w:fill="EAF1F8"/>
-          </w:tcPr>
-          <w:p>
-            <w:r>
-              <w:rPr>
-                <w:sz w:val="18"/>
-              </w:rPr>
-            </w:r>
-            <w:r>
-              <w:rPr>
-                <w:sz w:val="18"/>
-              </w:rPr>
-              <w:t>Title</w:t>
-            </w:r>
-          </w:p>
-        </w:tc>
-        <w:tc>
-          <w:tcPr>
-            <w:tcW w:type="dxa" w:w="4320"/>
-            <w:shd w:val="clear" w:color="auto" w:fill="EAF1F8"/>
-          </w:tcPr>
-          <w:p>
-            <w:r>
-              <w:rPr>
-                <w:sz w:val="18"/>
-              </w:rPr>
-            </w:r>
-            <w:r>
-              <w:rPr>
-                <w:sz w:val="18"/>
+                <w:rFonts w:ascii="Calibri" w:hAnsi="Calibri"/>
               </w:rPr>
               <w:t>_________________________</w:t>
             </w:r>
@@ -1838,14 +1859,40 @@
             <w:tcW w:type="dxa" w:w="4320"/>
           </w:tcPr>
           <w:p>
+            <w:r/>
             <w:r>
               <w:rPr>
-                <w:sz w:val="18"/>
+                <w:rFonts w:ascii="Calibri" w:hAnsi="Calibri"/>
               </w:rPr>
+              <w:t>Title</w:t>
             </w:r>
+          </w:p>
+        </w:tc>
+        <w:tc>
+          <w:tcPr>
+            <w:tcW w:type="dxa" w:w="4320"/>
+          </w:tcPr>
+          <w:p>
+            <w:r/>
             <w:r>
               <w:rPr>
-                <w:sz w:val="18"/>
+                <w:rFonts w:ascii="Calibri" w:hAnsi="Calibri"/>
+              </w:rPr>
+              <w:t>_________________________</w:t>
+            </w:r>
+          </w:p>
+        </w:tc>
+      </w:tr>
+      <w:tr>
+        <w:tc>
+          <w:tcPr>
+            <w:tcW w:type="dxa" w:w="4320"/>
+          </w:tcPr>
+          <w:p>
+            <w:r/>
+            <w:r>
+              <w:rPr>
+                <w:rFonts w:ascii="Calibri" w:hAnsi="Calibri"/>
               </w:rPr>
               <w:t>Date</w:t>
             </w:r>
@@ -1856,14 +1903,10 @@
             <w:tcW w:type="dxa" w:w="4320"/>
           </w:tcPr>
           <w:p>
+            <w:r/>
             <w:r>
               <w:rPr>
-                <w:sz w:val="18"/>
-              </w:rPr>
-            </w:r>
-            <w:r>
-              <w:rPr>
-                <w:sz w:val="18"/>
+                <w:rFonts w:ascii="Calibri" w:hAnsi="Calibri"/>
               </w:rPr>
               <w:t>_________________________</w:t>
             </w:r>
@@ -1874,17 +1917,12 @@
         <w:tc>
           <w:tcPr>
             <w:tcW w:type="dxa" w:w="4320"/>
-            <w:shd w:val="clear" w:color="auto" w:fill="EAF1F8"/>
           </w:tcPr>
           <w:p>
+            <w:r/>
             <w:r>
               <w:rPr>
-                <w:sz w:val="18"/>
-              </w:rPr>
-            </w:r>
-            <w:r>
-              <w:rPr>
-                <w:sz w:val="18"/>
+                <w:rFonts w:ascii="Calibri" w:hAnsi="Calibri"/>
               </w:rPr>
               <w:t>Signature</w:t>
             </w:r>
@@ -1893,17 +1931,12 @@
         <w:tc>
           <w:tcPr>
             <w:tcW w:type="dxa" w:w="4320"/>
-            <w:shd w:val="clear" w:color="auto" w:fill="EAF1F8"/>
           </w:tcPr>
           <w:p>
+            <w:r/>
             <w:r>
               <w:rPr>
-                <w:sz w:val="18"/>
-              </w:rPr>
-            </w:r>
-            <w:r>
-              <w:rPr>
-                <w:sz w:val="18"/>
+                <w:rFonts w:ascii="Calibri" w:hAnsi="Calibri"/>
               </w:rPr>
               <w:t>_________________________</w:t>
             </w:r>
@@ -1918,8 +1951,8 @@
       </w:pPr>
       <w:r>
         <w:rPr>
-          <w:color w:val="1F3B5C"/>
-          <w:sz w:val="24"/>
+          <w:rFonts w:ascii="Calibri" w:hAnsi="Calibri"/>
+          <w:color w:val="000000"/>
         </w:rPr>
         <w:t>Data Processor: Neon (NeonDB Inc.)</w:t>
       </w:r>
@@ -1928,7 +1961,6 @@
       <w:tblPr>
         <w:tblStyle w:val="TableGrid"/>
         <w:tblW w:type="auto" w:w="0"/>
-        <w:jc w:val="center"/>
         <w:tblLook w:firstColumn="1" w:firstRow="1" w:lastColumn="0" w:lastRow="0" w:noHBand="0" w:noVBand="1" w:val="04A0"/>
       </w:tblPr>
       <w:tblGrid>
@@ -1939,21 +1971,13 @@
         <w:tc>
           <w:tcPr>
             <w:tcW w:type="dxa" w:w="4320"/>
-            <w:shd w:val="clear" w:color="auto" w:fill="1F3B5C"/>
           </w:tcPr>
           <w:p>
+            <w:r/>
             <w:r>
               <w:rPr>
+                <w:rFonts w:ascii="Calibri" w:hAnsi="Calibri"/>
                 <w:b/>
-                <w:color w:val="FFFFFF"/>
-                <w:sz w:val="18"/>
-              </w:rPr>
-            </w:r>
-            <w:r>
-              <w:rPr>
-                <w:b/>
-                <w:color w:val="FFFFFF"/>
-                <w:sz w:val="18"/>
               </w:rPr>
               <w:t>Field</w:t>
             </w:r>
@@ -1962,21 +1986,13 @@
         <w:tc>
           <w:tcPr>
             <w:tcW w:type="dxa" w:w="4320"/>
-            <w:shd w:val="clear" w:color="auto" w:fill="1F3B5C"/>
           </w:tcPr>
           <w:p>
+            <w:r/>
             <w:r>
               <w:rPr>
+                <w:rFonts w:ascii="Calibri" w:hAnsi="Calibri"/>
                 <w:b/>
-                <w:color w:val="FFFFFF"/>
-                <w:sz w:val="18"/>
-              </w:rPr>
-            </w:r>
-            <w:r>
-              <w:rPr>
-                <w:b/>
-                <w:color w:val="FFFFFF"/>
-                <w:sz w:val="18"/>
               </w:rPr>
               <w:t>Details</w:t>
             </w:r>
@@ -1989,14 +2005,10 @@
             <w:tcW w:type="dxa" w:w="4320"/>
           </w:tcPr>
           <w:p>
+            <w:r/>
             <w:r>
               <w:rPr>
-                <w:sz w:val="18"/>
-              </w:rPr>
-            </w:r>
-            <w:r>
-              <w:rPr>
-                <w:sz w:val="18"/>
+                <w:rFonts w:ascii="Calibri" w:hAnsi="Calibri"/>
               </w:rPr>
               <w:t>Name</w:t>
             </w:r>
@@ -2007,54 +2019,10 @@
             <w:tcW w:type="dxa" w:w="4320"/>
           </w:tcPr>
           <w:p>
+            <w:r/>
             <w:r>
               <w:rPr>
-                <w:sz w:val="18"/>
-              </w:rPr>
-            </w:r>
-            <w:r>
-              <w:rPr>
-                <w:sz w:val="18"/>
-              </w:rPr>
-              <w:t>_________________________</w:t>
-            </w:r>
-          </w:p>
-        </w:tc>
-      </w:tr>
-      <w:tr>
-        <w:tc>
-          <w:tcPr>
-            <w:tcW w:type="dxa" w:w="4320"/>
-            <w:shd w:val="clear" w:color="auto" w:fill="EAF1F8"/>
-          </w:tcPr>
-          <w:p>
-            <w:r>
-              <w:rPr>
-                <w:sz w:val="18"/>
-              </w:rPr>
-            </w:r>
-            <w:r>
-              <w:rPr>
-                <w:sz w:val="18"/>
-              </w:rPr>
-              <w:t>Title</w:t>
-            </w:r>
-          </w:p>
-        </w:tc>
-        <w:tc>
-          <w:tcPr>
-            <w:tcW w:type="dxa" w:w="4320"/>
-            <w:shd w:val="clear" w:color="auto" w:fill="EAF1F8"/>
-          </w:tcPr>
-          <w:p>
-            <w:r>
-              <w:rPr>
-                <w:sz w:val="18"/>
-              </w:rPr>
-            </w:r>
-            <w:r>
-              <w:rPr>
-                <w:sz w:val="18"/>
+                <w:rFonts w:ascii="Calibri" w:hAnsi="Calibri"/>
               </w:rPr>
               <w:t>_________________________</w:t>
             </w:r>
@@ -2067,14 +2035,40 @@
             <w:tcW w:type="dxa" w:w="4320"/>
           </w:tcPr>
           <w:p>
+            <w:r/>
             <w:r>
               <w:rPr>
-                <w:sz w:val="18"/>
+                <w:rFonts w:ascii="Calibri" w:hAnsi="Calibri"/>
               </w:rPr>
+              <w:t>Title</w:t>
             </w:r>
+          </w:p>
+        </w:tc>
+        <w:tc>
+          <w:tcPr>
+            <w:tcW w:type="dxa" w:w="4320"/>
+          </w:tcPr>
+          <w:p>
+            <w:r/>
             <w:r>
               <w:rPr>
-                <w:sz w:val="18"/>
+                <w:rFonts w:ascii="Calibri" w:hAnsi="Calibri"/>
+              </w:rPr>
+              <w:t>_________________________</w:t>
+            </w:r>
+          </w:p>
+        </w:tc>
+      </w:tr>
+      <w:tr>
+        <w:tc>
+          <w:tcPr>
+            <w:tcW w:type="dxa" w:w="4320"/>
+          </w:tcPr>
+          <w:p>
+            <w:r/>
+            <w:r>
+              <w:rPr>
+                <w:rFonts w:ascii="Calibri" w:hAnsi="Calibri"/>
               </w:rPr>
               <w:t>Date</w:t>
             </w:r>
@@ -2085,14 +2079,10 @@
             <w:tcW w:type="dxa" w:w="4320"/>
           </w:tcPr>
           <w:p>
+            <w:r/>
             <w:r>
               <w:rPr>
-                <w:sz w:val="18"/>
-              </w:rPr>
-            </w:r>
-            <w:r>
-              <w:rPr>
-                <w:sz w:val="18"/>
+                <w:rFonts w:ascii="Calibri" w:hAnsi="Calibri"/>
               </w:rPr>
               <w:t>_________________________</w:t>
             </w:r>
@@ -2103,17 +2093,12 @@
         <w:tc>
           <w:tcPr>
             <w:tcW w:type="dxa" w:w="4320"/>
-            <w:shd w:val="clear" w:color="auto" w:fill="EAF1F8"/>
           </w:tcPr>
           <w:p>
+            <w:r/>
             <w:r>
               <w:rPr>
-                <w:sz w:val="18"/>
-              </w:rPr>
-            </w:r>
-            <w:r>
-              <w:rPr>
-                <w:sz w:val="18"/>
+                <w:rFonts w:ascii="Calibri" w:hAnsi="Calibri"/>
               </w:rPr>
               <w:t>Signature</w:t>
             </w:r>
@@ -2122,17 +2107,12 @@
         <w:tc>
           <w:tcPr>
             <w:tcW w:type="dxa" w:w="4320"/>
-            <w:shd w:val="clear" w:color="auto" w:fill="EAF1F8"/>
           </w:tcPr>
           <w:p>
+            <w:r/>
             <w:r>
               <w:rPr>
-                <w:sz w:val="18"/>
-              </w:rPr>
-            </w:r>
-            <w:r>
-              <w:rPr>
-                <w:sz w:val="18"/>
+                <w:rFonts w:ascii="Calibri" w:hAnsi="Calibri"/>
               </w:rPr>
               <w:t>_________________________</w:t>
             </w:r>
@@ -2142,18 +2122,28 @@
     </w:tbl>
     <w:p/>
     <w:p>
+      <w:pPr>
+        <w:pBdr>
+          <w:bottom w:val="single" w:sz="6" w:space="1" w:color="666666"/>
+        </w:pBdr>
+      </w:pPr>
+    </w:p>
+    <w:p>
       <w:r>
-        <w:t>______________________________</w:t>
+        <w:rPr>
+          <w:rFonts w:ascii="Calibri" w:hAnsi="Calibri"/>
+          <w:i/>
+        </w:rPr>
+        <w:t>Document prepared for LINEKORA Data Protection Compliance</w:t>
       </w:r>
     </w:p>
     <w:p>
       <w:r>
-        <w:t>*Document prepared for LINEKORA Data Protection Compliance*</w:t>
-      </w:r>
-    </w:p>
-    <w:p>
-      <w:r>
-        <w:t>*Pursuant to Rwanda Data Protection Law No. 3/2021*</w:t>
+        <w:rPr>
+          <w:rFonts w:ascii="Calibri" w:hAnsi="Calibri"/>
+          <w:i/>
+        </w:rPr>
+        <w:t>Pursuant to Rwanda Data Protection Law No. 058/2021 of 13/10/2021</w:t>
       </w:r>
     </w:p>
     <w:sectPr>
@@ -2530,8 +2520,8 @@
     <w:qFormat/>
     <w:rsid w:val="00FC693F"/>
     <w:rPr>
-      <w:rFonts w:ascii="Calibri" w:hAnsi="Calibri"/>
-      <w:sz w:val="20"/>
+      <w:rFonts w:ascii="Calibri" w:hAnsi="Calibri" w:eastAsia="Calibri"/>
+      <w:sz w:val="22"/>
     </w:rPr>
   </w:style>
   <w:style w:type="paragraph" w:styleId="Header">

</xml_diff>